<commit_message>
docs: Se corrigue ortografia al informe
</commit_message>
<xml_diff>
--- a/informe/Sumativa1_Informe_Maria_Fassler_Sebastian_Antunez.docx
+++ b/informe/Sumativa1_Informe_Maria_Fassler_Sebastian_Antunez.docx
@@ -202,25 +202,7 @@
           <w:sz w:val="24"/>
           <w:szCs w:val="24"/>
         </w:rPr>
-        <w:t xml:space="preserve">María </w:t>
-      </w:r>
-      <w:proofErr w:type="spellStart"/>
-      <w:r>
-        <w:rPr>
-          <w:rFonts w:ascii="Arial" w:eastAsia="Arial" w:hAnsi="Arial" w:cs="Arial"/>
-          <w:sz w:val="24"/>
-          <w:szCs w:val="24"/>
-        </w:rPr>
-        <w:t>Fassler</w:t>
-      </w:r>
-      <w:proofErr w:type="spellEnd"/>
-      <w:r>
-        <w:rPr>
-          <w:rFonts w:ascii="Arial" w:eastAsia="Arial" w:hAnsi="Arial" w:cs="Arial"/>
-          <w:sz w:val="24"/>
-          <w:szCs w:val="24"/>
-        </w:rPr>
-        <w:t xml:space="preserve"> Neumann / Sebastian Antunez Noguera</w:t>
+        <w:t>María Fassler Neumann / Sebastian Antunez Noguera</w:t>
       </w:r>
     </w:p>
     <w:p>
@@ -2152,6 +2134,7 @@
     <w:p>
       <w:pPr>
         <w:spacing w:line="300" w:lineRule="atLeast"/>
+        <w:jc w:val="both"/>
         <w:rPr>
           <w:rFonts w:asciiTheme="minorHAnsi" w:eastAsia="Times New Roman" w:hAnsiTheme="minorHAnsi" w:cstheme="minorHAnsi"/>
           <w:sz w:val="22"/>
@@ -2641,49 +2624,8 @@
                 <w:sz w:val="17"/>
                 <w:szCs w:val="17"/>
               </w:rPr>
-              <w:t xml:space="preserve">abandono (respuesta), </w:t>
-            </w:r>
-            <w:proofErr w:type="spellStart"/>
-            <w:r>
-              <w:rPr>
-                <w:sz w:val="17"/>
-                <w:szCs w:val="17"/>
-              </w:rPr>
-              <w:t>inst_acreditada</w:t>
-            </w:r>
-            <w:proofErr w:type="spellEnd"/>
-            <w:r>
-              <w:rPr>
-                <w:sz w:val="17"/>
-                <w:szCs w:val="17"/>
-              </w:rPr>
-              <w:t xml:space="preserve">, </w:t>
-            </w:r>
-            <w:proofErr w:type="spellStart"/>
-            <w:r>
-              <w:rPr>
-                <w:sz w:val="17"/>
-                <w:szCs w:val="17"/>
-              </w:rPr>
-              <w:t>pct_mujeres</w:t>
-            </w:r>
-            <w:proofErr w:type="spellEnd"/>
-            <w:r>
-              <w:rPr>
-                <w:sz w:val="17"/>
-                <w:szCs w:val="17"/>
-              </w:rPr>
-              <w:t xml:space="preserve">, </w:t>
-            </w:r>
-            <w:proofErr w:type="spellStart"/>
-            <w:r>
-              <w:rPr>
-                <w:sz w:val="17"/>
-                <w:szCs w:val="17"/>
-              </w:rPr>
-              <w:t>edad_promedio</w:t>
-            </w:r>
-            <w:proofErr w:type="spellEnd"/>
+              <w:t>abandono (respuesta), inst_acreditada, pct_mujeres, edad_promedio</w:t>
+            </w:r>
           </w:p>
         </w:tc>
       </w:tr>
@@ -2747,17 +2689,8 @@
                 <w:sz w:val="17"/>
                 <w:szCs w:val="17"/>
               </w:rPr>
-              <w:t xml:space="preserve">ingreso, titulados, </w:t>
-            </w:r>
-            <w:proofErr w:type="spellStart"/>
-            <w:r>
-              <w:rPr>
-                <w:sz w:val="17"/>
-                <w:szCs w:val="17"/>
-              </w:rPr>
-              <w:t>duracion_estudio_carrera</w:t>
-            </w:r>
-            <w:proofErr w:type="spellEnd"/>
+              <w:t>ingreso, titulados, duracion_estudio_carrera</w:t>
+            </w:r>
           </w:p>
         </w:tc>
       </w:tr>
@@ -2886,17 +2819,8 @@
                 <w:sz w:val="17"/>
                 <w:szCs w:val="17"/>
               </w:rPr>
-              <w:t xml:space="preserve">metropolitana, </w:t>
-            </w:r>
-            <w:proofErr w:type="spellStart"/>
-            <w:r>
-              <w:rPr>
-                <w:sz w:val="17"/>
-                <w:szCs w:val="17"/>
-              </w:rPr>
-              <w:t>inst_cerrada</w:t>
-            </w:r>
-            <w:proofErr w:type="spellEnd"/>
+              <w:t>metropolitana, inst_cerrada</w:t>
+            </w:r>
           </w:p>
         </w:tc>
       </w:tr>
@@ -2955,31 +2879,13 @@
             </w:tcMar>
           </w:tcPr>
           <w:p>
-            <w:proofErr w:type="spellStart"/>
-            <w:r>
-              <w:rPr>
-                <w:sz w:val="17"/>
-                <w:szCs w:val="17"/>
-              </w:rPr>
-              <w:t>codigo_carrera</w:t>
-            </w:r>
-            <w:proofErr w:type="spellEnd"/>
-            <w:r>
-              <w:rPr>
-                <w:sz w:val="17"/>
-                <w:szCs w:val="17"/>
-              </w:rPr>
-              <w:t xml:space="preserve">, </w:t>
-            </w:r>
-            <w:proofErr w:type="spellStart"/>
-            <w:r>
-              <w:rPr>
-                <w:sz w:val="17"/>
-                <w:szCs w:val="17"/>
-              </w:rPr>
-              <w:t>codigo_de_institucion</w:t>
-            </w:r>
-            <w:proofErr w:type="spellEnd"/>
+            <w:r>
+              <w:rPr>
+                <w:sz w:val="17"/>
+                <w:szCs w:val="17"/>
+              </w:rPr>
+              <w:t>codigo_carrera, codigo_de_institucion</w:t>
+            </w:r>
           </w:p>
         </w:tc>
       </w:tr>
@@ -3003,29 +2909,7 @@
           <w:szCs w:val="17"/>
         </w:rPr>
         <w:lastRenderedPageBreak/>
-        <w:t xml:space="preserve">Conviene advertir que </w:t>
-      </w:r>
-      <w:proofErr w:type="spellStart"/>
-      <w:r>
-        <w:rPr>
-          <w:i/>
-          <w:iCs/>
-          <w:color w:val="444444"/>
-          <w:sz w:val="17"/>
-          <w:szCs w:val="17"/>
-        </w:rPr>
-        <w:t>inst_acreditada</w:t>
-      </w:r>
-      <w:proofErr w:type="spellEnd"/>
-      <w:r>
-        <w:rPr>
-          <w:i/>
-          <w:iCs/>
-          <w:color w:val="444444"/>
-          <w:sz w:val="17"/>
-          <w:szCs w:val="17"/>
-        </w:rPr>
-        <w:t xml:space="preserve"> parece dicotómica y no lo es: toma 1.195 valores distintos entre 0 y 1 porque promedia el estado de acreditación a lo largo de los años de cohorte. Por eso los contrastes del apartado 5 comparan los dos extremos inequívocos —siempre acreditada (7.672 programas) frente a nunca acreditada (757)— y excluyen los 1.249 programas en transición.</w:t>
+        <w:t>Conviene advertir que inst_acreditada parece dicotómica y no lo es: toma 1.195 valores distintos entre 0 y 1 porque promedia el estado de acreditación a lo largo de los años de cohorte. Por eso los contrastes del apartado 5 comparan los dos extremos inequívocos —siempre acreditada (7.672 programas) frente a nunca acreditada (757)— y excluyen los 1.249 programas en transición.</w:t>
       </w:r>
     </w:p>
     <w:p>
@@ -4362,21 +4246,12 @@
             </w:tcMar>
           </w:tcPr>
           <w:p>
-            <w:proofErr w:type="spellStart"/>
-            <w:r>
-              <w:rPr>
-                <w:sz w:val="17"/>
-                <w:szCs w:val="17"/>
-              </w:rPr>
-              <w:t>Coef</w:t>
-            </w:r>
-            <w:proofErr w:type="spellEnd"/>
-            <w:r>
-              <w:rPr>
-                <w:sz w:val="17"/>
-                <w:szCs w:val="17"/>
-              </w:rPr>
-              <w:t>. de variación</w:t>
+            <w:r>
+              <w:rPr>
+                <w:sz w:val="17"/>
+                <w:szCs w:val="17"/>
+              </w:rPr>
+              <w:t>Coef. de variación</w:t>
             </w:r>
           </w:p>
         </w:tc>
@@ -7980,39 +7855,7 @@
                 <w:sz w:val="17"/>
                 <w:szCs w:val="17"/>
               </w:rPr>
-              <w:t xml:space="preserve">t de </w:t>
-            </w:r>
-            <w:proofErr w:type="spellStart"/>
-            <w:r>
-              <w:rPr>
-                <w:sz w:val="17"/>
-                <w:szCs w:val="17"/>
-              </w:rPr>
-              <w:t>Student</w:t>
-            </w:r>
-            <w:proofErr w:type="spellEnd"/>
-            <w:r>
-              <w:rPr>
-                <w:sz w:val="17"/>
-                <w:szCs w:val="17"/>
-              </w:rPr>
-              <w:t xml:space="preserve">, </w:t>
-            </w:r>
-            <w:proofErr w:type="spellStart"/>
-            <w:r>
-              <w:rPr>
-                <w:sz w:val="17"/>
-                <w:szCs w:val="17"/>
-              </w:rPr>
-              <w:t>gl</w:t>
-            </w:r>
-            <w:proofErr w:type="spellEnd"/>
-            <w:r>
-              <w:rPr>
-                <w:sz w:val="17"/>
-                <w:szCs w:val="17"/>
-              </w:rPr>
-              <w:t xml:space="preserve"> = 9.677</w:t>
+              <w:t>t de Student, gl = 9.677</w:t>
             </w:r>
           </w:p>
         </w:tc>
@@ -8114,39 +7957,7 @@
                 <w:sz w:val="17"/>
                 <w:szCs w:val="17"/>
               </w:rPr>
-              <w:t xml:space="preserve">t de </w:t>
-            </w:r>
-            <w:proofErr w:type="spellStart"/>
-            <w:r>
-              <w:rPr>
-                <w:sz w:val="17"/>
-                <w:szCs w:val="17"/>
-              </w:rPr>
-              <w:t>Student</w:t>
-            </w:r>
-            <w:proofErr w:type="spellEnd"/>
-            <w:r>
-              <w:rPr>
-                <w:sz w:val="17"/>
-                <w:szCs w:val="17"/>
-              </w:rPr>
-              <w:t xml:space="preserve">, </w:t>
-            </w:r>
-            <w:proofErr w:type="spellStart"/>
-            <w:r>
-              <w:rPr>
-                <w:sz w:val="17"/>
-                <w:szCs w:val="17"/>
-              </w:rPr>
-              <w:t>gl</w:t>
-            </w:r>
-            <w:proofErr w:type="spellEnd"/>
-            <w:r>
-              <w:rPr>
-                <w:sz w:val="17"/>
-                <w:szCs w:val="17"/>
-              </w:rPr>
-              <w:t xml:space="preserve"> = 9.677</w:t>
+              <w:t>t de Student, gl = 9.677</w:t>
             </w:r>
           </w:p>
         </w:tc>
@@ -8248,39 +8059,7 @@
                 <w:sz w:val="17"/>
                 <w:szCs w:val="17"/>
               </w:rPr>
-              <w:t xml:space="preserve">t de </w:t>
-            </w:r>
-            <w:proofErr w:type="spellStart"/>
-            <w:r>
-              <w:rPr>
-                <w:sz w:val="17"/>
-                <w:szCs w:val="17"/>
-              </w:rPr>
-              <w:t>Student</w:t>
-            </w:r>
-            <w:proofErr w:type="spellEnd"/>
-            <w:r>
-              <w:rPr>
-                <w:sz w:val="17"/>
-                <w:szCs w:val="17"/>
-              </w:rPr>
-              <w:t xml:space="preserve">, </w:t>
-            </w:r>
-            <w:proofErr w:type="spellStart"/>
-            <w:r>
-              <w:rPr>
-                <w:sz w:val="17"/>
-                <w:szCs w:val="17"/>
-              </w:rPr>
-              <w:t>gl</w:t>
-            </w:r>
-            <w:proofErr w:type="spellEnd"/>
-            <w:r>
-              <w:rPr>
-                <w:sz w:val="17"/>
-                <w:szCs w:val="17"/>
-              </w:rPr>
-              <w:t xml:space="preserve"> = 9.677</w:t>
+              <w:t>t de Student, gl = 9.677</w:t>
             </w:r>
           </w:p>
         </w:tc>
@@ -8484,23 +8263,7 @@
                 <w:sz w:val="17"/>
                 <w:szCs w:val="17"/>
               </w:rPr>
-              <w:t xml:space="preserve">Welch, </w:t>
-            </w:r>
-            <w:proofErr w:type="spellStart"/>
-            <w:r>
-              <w:rPr>
-                <w:sz w:val="17"/>
-                <w:szCs w:val="17"/>
-              </w:rPr>
-              <w:t>gl</w:t>
-            </w:r>
-            <w:proofErr w:type="spellEnd"/>
-            <w:r>
-              <w:rPr>
-                <w:sz w:val="17"/>
-                <w:szCs w:val="17"/>
-              </w:rPr>
-              <w:t xml:space="preserve"> = 902</w:t>
+              <w:t>Welch, gl = 902</w:t>
             </w:r>
           </w:p>
         </w:tc>
@@ -8515,25 +8278,41 @@
       <w:pPr>
         <w:spacing w:after="120" w:line="264" w:lineRule="auto"/>
         <w:jc w:val="both"/>
+        <w:rPr>
+          <w:sz w:val="22"/>
+          <w:szCs w:val="22"/>
+        </w:rPr>
       </w:pPr>
       <w:r>
         <w:rPr>
           <w:b/>
           <w:bCs/>
+          <w:sz w:val="22"/>
+          <w:szCs w:val="22"/>
         </w:rPr>
         <w:t>Las tres medias.</w:t>
       </w:r>
       <w:r>
+        <w:rPr>
+          <w:sz w:val="22"/>
+          <w:szCs w:val="22"/>
+        </w:rPr>
         <w:t xml:space="preserve"> La edad media de 24,16 años es alta para pregrado y refleja el peso de la jornada vespertina, que agrupa al 35,5 % de los programas. La proporción de mujeres, 0,5156, describe un sistema equilibrado en promedio, pero su desviación estándar de 0,296 revela una segregación fuerte por programa: hay carreras casi enteramente masculinas y otras casi enteramente femeninas. Ese tercer caso ilustra bien el riesgo de leer mal un intervalo estrecho, porque lo que afirma es que </w:t>
       </w:r>
       <w:r>
         <w:rPr>
           <w:i/>
           <w:iCs/>
+          <w:sz w:val="22"/>
+          <w:szCs w:val="22"/>
         </w:rPr>
         <w:t>el promedio del sistema</w:t>
       </w:r>
       <w:r>
+        <w:rPr>
+          <w:sz w:val="22"/>
+          <w:szCs w:val="22"/>
+        </w:rPr>
         <w:t xml:space="preserve"> se conoce con precisión, no que los programas se parezcan entre sí.</w:t>
       </w:r>
     </w:p>
@@ -8541,55 +8320,81 @@
       <w:pPr>
         <w:spacing w:after="120" w:line="264" w:lineRule="auto"/>
         <w:jc w:val="both"/>
+        <w:rPr>
+          <w:sz w:val="22"/>
+          <w:szCs w:val="22"/>
+        </w:rPr>
       </w:pPr>
       <w:r>
         <w:rPr>
           <w:b/>
           <w:bCs/>
+          <w:sz w:val="22"/>
+          <w:szCs w:val="22"/>
         </w:rPr>
         <w:t>El abandono.</w:t>
       </w:r>
       <w:r>
+        <w:rPr>
+          <w:sz w:val="22"/>
+          <w:szCs w:val="22"/>
+        </w:rPr>
         <w:t xml:space="preserve"> El intervalo mide nueve milésimas de ancho. Esa precisión no proviene de que el fenómeno sea homogéneo</w:t>
       </w:r>
       <w:r>
+        <w:rPr>
+          <w:sz w:val="22"/>
+          <w:szCs w:val="22"/>
+        </w:rPr>
         <w:t xml:space="preserve">, </w:t>
       </w:r>
       <w:r>
+        <w:rPr>
+          <w:sz w:val="22"/>
+          <w:szCs w:val="22"/>
+        </w:rPr>
         <w:t>la desviación estándar de 0,224 dice lo contrario</w:t>
       </w:r>
       <w:r>
+        <w:rPr>
+          <w:sz w:val="22"/>
+          <w:szCs w:val="22"/>
+        </w:rPr>
         <w:t xml:space="preserve">, </w:t>
       </w:r>
       <w:r>
+        <w:rPr>
+          <w:sz w:val="22"/>
+          <w:szCs w:val="22"/>
+        </w:rPr>
         <w:t>sino del tamaño del conjunto</w:t>
       </w:r>
       <w:r>
+        <w:rPr>
+          <w:sz w:val="22"/>
+          <w:szCs w:val="22"/>
+        </w:rPr>
         <w:t>. E</w:t>
       </w:r>
       <w:r>
-        <w:t xml:space="preserve">l error estándar divide la desviación por la raíz de 9.678, es decir por 98,4. Conviene no confundir precisión con homogeneidad: el intervalo describe cuán bien conocemos el promedio, no cuán parecidos son los programas entre sí. Un </w:t>
-      </w:r>
-      <w:proofErr w:type="spellStart"/>
-      <w:r>
-        <w:t>remuestreo</w:t>
-      </w:r>
-      <w:proofErr w:type="spellEnd"/>
-      <w:r>
-        <w:t xml:space="preserve"> </w:t>
-      </w:r>
-      <w:proofErr w:type="spellStart"/>
-      <w:r>
-        <w:t>bootstrap</w:t>
-      </w:r>
-      <w:proofErr w:type="spellEnd"/>
-      <w:r>
-        <w:t xml:space="preserve"> de 5.000 réplicas arroja [0,</w:t>
-      </w:r>
-      <w:r>
+        <w:rPr>
+          <w:sz w:val="22"/>
+          <w:szCs w:val="22"/>
+        </w:rPr>
+        <w:t>l error estándar divide la desviación por la raíz de 9.678, es decir por 98,4. Conviene no confundir precisión con homogeneidad: el intervalo describe cuán bien conocemos el promedio, no cuán parecidos son los programas entre sí. Un remuestreo bootstrap de 5.000 réplicas arroja [0,</w:t>
+      </w:r>
+      <w:r>
+        <w:rPr>
+          <w:sz w:val="22"/>
+          <w:szCs w:val="22"/>
+        </w:rPr>
         <w:t>5139;</w:t>
       </w:r>
       <w:r>
+        <w:rPr>
+          <w:sz w:val="22"/>
+          <w:szCs w:val="22"/>
+        </w:rPr>
         <w:t xml:space="preserve"> 0,5226], coincidente hasta la cuarta cifra, lo que confirma que el supuesto de normalidad de la media es sostenible.</w:t>
       </w:r>
     </w:p>
@@ -8597,25 +8402,41 @@
       <w:pPr>
         <w:spacing w:after="120" w:line="264" w:lineRule="auto"/>
         <w:jc w:val="both"/>
+        <w:rPr>
+          <w:sz w:val="22"/>
+          <w:szCs w:val="22"/>
+        </w:rPr>
       </w:pPr>
       <w:r>
         <w:rPr>
           <w:b/>
           <w:bCs/>
+          <w:sz w:val="22"/>
+          <w:szCs w:val="22"/>
         </w:rPr>
         <w:t>La proporción.</w:t>
       </w:r>
       <w:r>
+        <w:rPr>
+          <w:sz w:val="22"/>
+          <w:szCs w:val="22"/>
+        </w:rPr>
         <w:t xml:space="preserve"> Se emplea el método de Wilson (1927) en lugar de la aproximación normal porque no produce límites fuera del intervalo [0, 1] y conserva su cobertura cerca de los extremos. Con una proporción próxima a 0,5 y un </w:t>
       </w:r>
       <w:r>
         <w:rPr>
           <w:i/>
           <w:iCs/>
+          <w:sz w:val="22"/>
+          <w:szCs w:val="22"/>
         </w:rPr>
         <w:t>n</w:t>
       </w:r>
       <w:r>
+        <w:rPr>
+          <w:sz w:val="22"/>
+          <w:szCs w:val="22"/>
+        </w:rPr>
         <w:t xml:space="preserve"> grande ambos coinciden, pero la elección deja de ser indiferente en otros escenarios.</w:t>
       </w:r>
     </w:p>
@@ -8623,15 +8444,25 @@
       <w:pPr>
         <w:spacing w:after="120" w:line="264" w:lineRule="auto"/>
         <w:jc w:val="both"/>
+        <w:rPr>
+          <w:sz w:val="22"/>
+          <w:szCs w:val="22"/>
+        </w:rPr>
       </w:pPr>
       <w:r>
         <w:rPr>
           <w:b/>
           <w:bCs/>
+          <w:sz w:val="22"/>
+          <w:szCs w:val="22"/>
         </w:rPr>
         <w:t>La diferencia.</w:t>
       </w:r>
       <w:r>
+        <w:rPr>
+          <w:sz w:val="22"/>
+          <w:szCs w:val="22"/>
+        </w:rPr>
         <w:t xml:space="preserve"> El intervalo no contiene el cero y su límite inferior ya alcanza los 15,9 puntos porcentuales, de modo que la conclusión no depende del extremo del intervalo que se tome.</w:t>
       </w:r>
     </w:p>
@@ -8774,8 +8605,16 @@
       <w:pPr>
         <w:spacing w:after="120" w:line="264" w:lineRule="auto"/>
         <w:jc w:val="both"/>
-      </w:pPr>
-      <w:r>
+        <w:rPr>
+          <w:sz w:val="22"/>
+          <w:szCs w:val="22"/>
+        </w:rPr>
+      </w:pPr>
+      <w:r>
+        <w:rPr>
+          <w:sz w:val="22"/>
+          <w:szCs w:val="22"/>
+        </w:rPr>
         <w:t>El gráfico Q-Q confirma el diagnóstico y además lo explica: los puntos siguen la recta en todo el tramo central, con una correlación cuantil-cuantil de 0,995, y se apartan solo en los extremos. Esas dos mesetas horizontales son los programas acotados en 0 y en 1 que el apartado 3.1 identificó. La desviación respecto de la normal no es, por tanto, un rasgo difuso de la distribución, sino el efecto localizado de la censura que introduce el método de cálculo.</w:t>
       </w:r>
     </w:p>
@@ -8783,21 +8622,39 @@
       <w:pPr>
         <w:spacing w:after="120" w:line="264" w:lineRule="auto"/>
         <w:jc w:val="both"/>
+        <w:rPr>
+          <w:sz w:val="22"/>
+          <w:szCs w:val="22"/>
+        </w:rPr>
       </w:pPr>
       <w:r>
         <w:rPr>
           <w:b/>
           <w:bCs/>
+          <w:sz w:val="22"/>
+          <w:szCs w:val="22"/>
         </w:rPr>
         <w:t>Homogeneidad de varianzas.</w:t>
       </w:r>
       <w:r>
+        <w:rPr>
+          <w:sz w:val="22"/>
+          <w:szCs w:val="22"/>
+        </w:rPr>
         <w:t xml:space="preserve"> La prueba de Levene no la rechaza (W = 0,869; p = 0,351); aun </w:t>
       </w:r>
       <w:r>
+        <w:rPr>
+          <w:sz w:val="22"/>
+          <w:szCs w:val="22"/>
+        </w:rPr>
         <w:t>así,</w:t>
       </w:r>
       <w:r>
+        <w:rPr>
+          <w:sz w:val="22"/>
+          <w:szCs w:val="22"/>
+        </w:rPr>
         <w:t xml:space="preserve"> se emplea la versión de Welch (1947), que no la supone, por ser la opción conservadora.</w:t>
       </w:r>
     </w:p>
@@ -8853,6 +8710,7 @@
           <w:sz w:val="22"/>
           <w:szCs w:val="22"/>
         </w:rPr>
+        <w:lastRenderedPageBreak/>
         <w:t>La segunda pregunta traslada la misma comparación a una proporción: ¿superan el umbral más de la mitad de los programas? Con H₀: p = 0,50 y el error estándar calculado bajo la hipótesis nula, el contraste Z de una muestra da Z = 9,72 y p &lt; 0,001, y de nuevo el tamaño del efecto lo relativiza, con una h de Cohen de 0,099.</w:t>
       </w:r>
     </w:p>
@@ -8870,7 +8728,6 @@
           <w:sz w:val="22"/>
           <w:szCs w:val="22"/>
         </w:rPr>
-        <w:lastRenderedPageBreak/>
         <w:t>Ambos coinciden en una lectura que el valor p, por sí solo, invitaría a negar: el sistema chileno se sitúa justo en el umbral del 50 %, no claramente por encima.</w:t>
       </w:r>
     </w:p>
@@ -9101,23 +8958,7 @@
                 <w:sz w:val="17"/>
                 <w:szCs w:val="17"/>
               </w:rPr>
-              <w:t>t = 8,04 (</w:t>
-            </w:r>
-            <w:proofErr w:type="spellStart"/>
-            <w:r>
-              <w:rPr>
-                <w:sz w:val="17"/>
-                <w:szCs w:val="17"/>
-              </w:rPr>
-              <w:t>gl</w:t>
-            </w:r>
-            <w:proofErr w:type="spellEnd"/>
-            <w:r>
-              <w:rPr>
-                <w:sz w:val="17"/>
-                <w:szCs w:val="17"/>
-              </w:rPr>
-              <w:t xml:space="preserve"> = 9.677)</w:t>
+              <w:t>t = 8,04 (gl = 9.677)</w:t>
             </w:r>
           </w:p>
         </w:tc>
@@ -9333,23 +9174,7 @@
                 <w:sz w:val="17"/>
                 <w:szCs w:val="17"/>
               </w:rPr>
-              <w:t>t = 20,61 (</w:t>
-            </w:r>
-            <w:proofErr w:type="spellStart"/>
-            <w:r>
-              <w:rPr>
-                <w:sz w:val="17"/>
-                <w:szCs w:val="17"/>
-              </w:rPr>
-              <w:t>gl</w:t>
-            </w:r>
-            <w:proofErr w:type="spellEnd"/>
-            <w:r>
-              <w:rPr>
-                <w:sz w:val="17"/>
-                <w:szCs w:val="17"/>
-              </w:rPr>
-              <w:t xml:space="preserve"> = 902)</w:t>
+              <w:t>t = 20,61 (gl = 902)</w:t>
             </w:r>
           </w:p>
         </w:tc>
@@ -9457,23 +9282,7 @@
                 <w:sz w:val="17"/>
                 <w:szCs w:val="17"/>
               </w:rPr>
-              <w:t>F = 44,30 (</w:t>
-            </w:r>
-            <w:proofErr w:type="spellStart"/>
-            <w:r>
-              <w:rPr>
-                <w:sz w:val="17"/>
-                <w:szCs w:val="17"/>
-              </w:rPr>
-              <w:t>gl</w:t>
-            </w:r>
-            <w:proofErr w:type="spellEnd"/>
-            <w:r>
-              <w:rPr>
-                <w:sz w:val="17"/>
-                <w:szCs w:val="17"/>
-              </w:rPr>
-              <w:t xml:space="preserve"> = 9; 9.668)</w:t>
+              <w:t>F = 44,30 (gl = 9; 9.668)</w:t>
             </w:r>
           </w:p>
         </w:tc>
@@ -9581,23 +9390,7 @@
                 <w:sz w:val="17"/>
                 <w:szCs w:val="17"/>
               </w:rPr>
-              <w:t>χ² = 102,51 (</w:t>
-            </w:r>
-            <w:proofErr w:type="spellStart"/>
-            <w:r>
-              <w:rPr>
-                <w:sz w:val="17"/>
-                <w:szCs w:val="17"/>
-              </w:rPr>
-              <w:t>gl</w:t>
-            </w:r>
-            <w:proofErr w:type="spellEnd"/>
-            <w:r>
-              <w:rPr>
-                <w:sz w:val="17"/>
-                <w:szCs w:val="17"/>
-              </w:rPr>
-              <w:t xml:space="preserve"> = 5)</w:t>
+              <w:t>χ² = 102,51 (gl = 5)</w:t>
             </w:r>
           </w:p>
         </w:tc>
@@ -9640,23 +9433,7 @@
                 <w:sz w:val="17"/>
                 <w:szCs w:val="17"/>
               </w:rPr>
-              <w:t xml:space="preserve">V de </w:t>
-            </w:r>
-            <w:proofErr w:type="spellStart"/>
-            <w:r>
-              <w:rPr>
-                <w:sz w:val="17"/>
-                <w:szCs w:val="17"/>
-              </w:rPr>
-              <w:t>Cramér</w:t>
-            </w:r>
-            <w:proofErr w:type="spellEnd"/>
-            <w:r>
-              <w:rPr>
-                <w:sz w:val="17"/>
-                <w:szCs w:val="17"/>
-              </w:rPr>
-              <w:t xml:space="preserve"> = 0,103 — débil</w:t>
+              <w:t>V de Cramér = 0,103 — débil</w:t>
             </w:r>
           </w:p>
         </w:tc>
@@ -9698,23 +9475,21 @@
           <w:sz w:val="22"/>
           <w:szCs w:val="22"/>
         </w:rPr>
-        <w:t xml:space="preserve">Los programas de instituciones nunca acreditadas presentan un abandono 17,6 puntos porcentuales mayor, con una d de Cohen de 0,80 que la convención establecida por Cohen (1988) sitúa en el umbral de los efectos grandes: la acreditación no solo distingue grupos de forma detectable, sino de forma sustantiva. El área del conocimiento, en cambio, explica apenas el 4 % de la varianza del abandono, y el tipo de institución arroja una asociación que la V de </w:t>
-      </w:r>
-      <w:proofErr w:type="spellStart"/>
-      <w:r>
-        <w:rPr>
-          <w:sz w:val="22"/>
-          <w:szCs w:val="22"/>
-        </w:rPr>
-        <w:t>Cramér</w:t>
-      </w:r>
-      <w:proofErr w:type="spellEnd"/>
-      <w:r>
-        <w:rPr>
-          <w:sz w:val="22"/>
-          <w:szCs w:val="22"/>
-        </w:rPr>
-        <w:t xml:space="preserve"> (1946) califica de débil, coherente con el solapamiento que ya mostraba la figura 3.</w:t>
+        <w:t>Los programas de instituciones nunca acreditadas presentan un abandono 17,6 puntos porcentuales mayor, con una d de Cohen de 0,80 que la convención establecida por Cohen (1988) sitúa en el umbral de los efectos grandes</w:t>
+      </w:r>
+      <w:r>
+        <w:rPr>
+          <w:sz w:val="22"/>
+          <w:szCs w:val="22"/>
+        </w:rPr>
+        <w:t>,</w:t>
+      </w:r>
+      <w:r>
+        <w:rPr>
+          <w:sz w:val="22"/>
+          <w:szCs w:val="22"/>
+        </w:rPr>
+        <w:t xml:space="preserve"> la acreditación no solo distingue grupos de forma detectable, sino de forma sustantiva. El área del conocimiento, en cambio, explica apenas el 4 % de la varianza del abandono, y el tipo de institución arroja una asociación que la V de Cramér (1946) califica de débil, coherente con el solapamiento que ya mostraba la figura 3.</w:t>
       </w:r>
     </w:p>
     <w:p>
@@ -9731,55 +9506,21 @@
           <w:sz w:val="22"/>
           <w:szCs w:val="22"/>
         </w:rPr>
-        <w:t xml:space="preserve">Con 9.678 observaciones la potencia es tan alta que el valor p pierde casi toda capacidad de discriminar: los cinco contrastes rechazan con valores entre 10⁻¹⁵ y 10⁻⁷⁸, y aun así sus efectos recorren toda la escala, de grande (d = 0,80) a despreciable (d = 0,082). Informar solo la significación llevaría a tratar los tres resultados como equivalentes, que es exactamente el error que una decisión de focalización no puede permitirse. La advertencia es la misma que formula la American </w:t>
-      </w:r>
-      <w:proofErr w:type="spellStart"/>
-      <w:r>
-        <w:rPr>
-          <w:sz w:val="22"/>
-          <w:szCs w:val="22"/>
-        </w:rPr>
-        <w:t>Statistical</w:t>
-      </w:r>
-      <w:proofErr w:type="spellEnd"/>
-      <w:r>
-        <w:rPr>
-          <w:sz w:val="22"/>
-          <w:szCs w:val="22"/>
-        </w:rPr>
-        <w:t xml:space="preserve"> </w:t>
-      </w:r>
-      <w:proofErr w:type="spellStart"/>
-      <w:r>
-        <w:rPr>
-          <w:sz w:val="22"/>
-          <w:szCs w:val="22"/>
-        </w:rPr>
-        <w:t>Association</w:t>
-      </w:r>
-      <w:proofErr w:type="spellEnd"/>
-      <w:r>
-        <w:rPr>
-          <w:sz w:val="22"/>
-          <w:szCs w:val="22"/>
-        </w:rPr>
-        <w:t xml:space="preserve"> al recordar que un valor p, por sí solo, no mide la magnitud de un efecto ni su relevancia práctica (</w:t>
-      </w:r>
-      <w:proofErr w:type="spellStart"/>
-      <w:r>
-        <w:rPr>
-          <w:sz w:val="22"/>
-          <w:szCs w:val="22"/>
-        </w:rPr>
-        <w:t>Wasserstein</w:t>
-      </w:r>
-      <w:proofErr w:type="spellEnd"/>
-      <w:r>
-        <w:rPr>
-          <w:sz w:val="22"/>
-          <w:szCs w:val="22"/>
-        </w:rPr>
-        <w:t xml:space="preserve"> y Lazar, 2016).</w:t>
+        <w:t>Con 9.678 observaciones la potencia es tan alta que el valor p pierde casi toda capacidad de discriminar</w:t>
+      </w:r>
+      <w:r>
+        <w:rPr>
+          <w:sz w:val="22"/>
+          <w:szCs w:val="22"/>
+        </w:rPr>
+        <w:t xml:space="preserve">, </w:t>
+      </w:r>
+      <w:r>
+        <w:rPr>
+          <w:sz w:val="22"/>
+          <w:szCs w:val="22"/>
+        </w:rPr>
+        <w:t>los cinco contrastes rechazan con valores entre 10⁻¹⁵ y 10⁻⁷⁸, y aun así sus efectos recorren toda la escala, de grande (d = 0,80) a despreciable (d = 0,082). Informar solo la significación llevaría a tratar los tres resultados como equivalentes, que es exactamente el error que una decisión de focalización no puede permitirse. La advertencia es la misma que formula la American Statistical Association al recordar que un valor p, por sí solo, no mide la magnitud de un efecto ni su relevancia práctica (Wasserstein y Lazar, 2016).</w:t>
       </w:r>
     </w:p>
     <w:p>
@@ -9905,6 +9646,7 @@
           <w:sz w:val="22"/>
           <w:szCs w:val="22"/>
         </w:rPr>
+        <w:lastRenderedPageBreak/>
         <w:t xml:space="preserve">Los resultados también indican que algunos criterios de segmentación son más útiles que otros para orientar la asignación de recursos. </w:t>
       </w:r>
       <w:r>
@@ -9913,16 +9655,7 @@
           <w:sz w:val="22"/>
           <w:szCs w:val="22"/>
         </w:rPr>
-        <w:t xml:space="preserve">La acreditación institucional separa grupos con una diferencia de 17,6 puntos y un efecto grande: es un criterio útil. El área del conocimiento y el tipo de institución producen contrastes igual de </w:t>
-      </w:r>
-      <w:r>
-        <w:rPr>
-          <w:rFonts w:asciiTheme="minorHAnsi" w:hAnsiTheme="minorHAnsi" w:cstheme="minorHAnsi"/>
-          <w:sz w:val="22"/>
-          <w:szCs w:val="22"/>
-        </w:rPr>
-        <w:lastRenderedPageBreak/>
-        <w:t>significativos, pero con efectos pequeños, porque la mayor parte de la variación ocurre dentro de cada categoría y no entre ellas; usarlos como criterio principal repartiría recursos con poca ganancia.</w:t>
+        <w:t>La acreditación institucional separa grupos con una diferencia de 17,6 puntos y un efecto grande: es un criterio útil. El área del conocimiento y el tipo de institución producen contrastes igual de significativos, pero con efectos pequeños, porque la mayor parte de la variación ocurre dentro de cada categoría y no entre ellas; usarlos como criterio principal repartiría recursos con poca ganancia.</w:t>
       </w:r>
     </w:p>
     <w:p>
@@ -10023,25 +9756,7 @@
           <w:sz w:val="22"/>
           <w:szCs w:val="22"/>
         </w:rPr>
-        <w:t xml:space="preserve">no hay grupo de control ni asignación aleatoria, y la acreditación podría estar recogiendo el efecto de la selectividad del ingreso o de los recursos de la institución. La ventana temporal trunca las cohortes recientes, cuyo abandono aparente queda inflado. Y los contrastes son </w:t>
-      </w:r>
-      <w:proofErr w:type="spellStart"/>
-      <w:r>
-        <w:rPr>
-          <w:rFonts w:asciiTheme="minorHAnsi" w:hAnsiTheme="minorHAnsi" w:cstheme="minorHAnsi"/>
-          <w:sz w:val="22"/>
-          <w:szCs w:val="22"/>
-        </w:rPr>
-        <w:t>univariados</w:t>
-      </w:r>
-      <w:proofErr w:type="spellEnd"/>
-      <w:r>
-        <w:rPr>
-          <w:rFonts w:asciiTheme="minorHAnsi" w:hAnsiTheme="minorHAnsi" w:cstheme="minorHAnsi"/>
-          <w:sz w:val="22"/>
-          <w:szCs w:val="22"/>
-        </w:rPr>
-        <w:t>, de modo que los efectos podrían estar confundidos entre sí; un modelo multivariado, previsto para la fase siguiente, permitiría estimar cada efecto manteniendo las demás constantes.</w:t>
+        <w:t>no hay grupo de control ni asignación aleatoria, y la acreditación podría estar recogiendo el efecto de la selectividad del ingreso o de los recursos de la institución. La ventana temporal trunca las cohortes recientes, cuyo abandono aparente queda inflado. Y los contrastes son univariados, de modo que los efectos podrían estar confundidos entre sí; un modelo multivariado, previsto para la fase siguiente, permitiría estimar cada efecto manteniendo las demás constantes.</w:t>
       </w:r>
     </w:p>
     <w:p>
@@ -10081,18 +9796,8 @@
           <w:sz w:val="22"/>
           <w:szCs w:val="22"/>
         </w:rPr>
-        <w:t xml:space="preserve">El análisis realizado es </w:t>
-      </w:r>
-      <w:proofErr w:type="spellStart"/>
-      <w:r>
-        <w:rPr>
-          <w:rFonts w:asciiTheme="minorHAnsi" w:hAnsiTheme="minorHAnsi" w:cstheme="minorHAnsi"/>
-          <w:sz w:val="22"/>
-          <w:szCs w:val="22"/>
-        </w:rPr>
-        <w:t>univariado</w:t>
-      </w:r>
-      <w:proofErr w:type="spellEnd"/>
+        <w:t>El análisis realizado es univariado</w:t>
+      </w:r>
       <w:r>
         <w:rPr>
           <w:rFonts w:asciiTheme="minorHAnsi" w:hAnsiTheme="minorHAnsi" w:cstheme="minorHAnsi"/>
@@ -10244,6 +9949,7 @@
           <w:sz w:val="22"/>
           <w:szCs w:val="22"/>
         </w:rPr>
+        <w:lastRenderedPageBreak/>
         <w:t>5. Capacidad predictiva.</w:t>
       </w:r>
       <w:r>
@@ -10252,37 +9958,8 @@
           <w:sz w:val="22"/>
           <w:szCs w:val="22"/>
         </w:rPr>
-        <w:t xml:space="preserve"> Con el modelo ajustado podría evaluarse si el abandono de un programa es </w:t>
-      </w:r>
-      <w:proofErr w:type="spellStart"/>
-      <w:r>
-        <w:rPr>
-          <w:rFonts w:asciiTheme="minorHAnsi" w:hAnsiTheme="minorHAnsi" w:cstheme="minorHAnsi"/>
-          <w:sz w:val="22"/>
-          <w:szCs w:val="22"/>
-        </w:rPr>
-        <w:t>anticipable</w:t>
-      </w:r>
-      <w:proofErr w:type="spellEnd"/>
-      <w:r>
-        <w:rPr>
-          <w:rFonts w:asciiTheme="minorHAnsi" w:hAnsiTheme="minorHAnsi" w:cstheme="minorHAnsi"/>
-          <w:sz w:val="22"/>
-          <w:szCs w:val="22"/>
-        </w:rPr>
-        <w:t xml:space="preserve"> a partir de sus características observables, que es la pregunta que convierte el diagnóstico en un instrumento de focalización.</w:t>
-      </w:r>
-    </w:p>
-    <w:p>
-      <w:pPr>
-        <w:spacing w:after="120" w:line="264" w:lineRule="auto"/>
-        <w:jc w:val="both"/>
-        <w:rPr>
-          <w:rFonts w:asciiTheme="minorHAnsi" w:hAnsiTheme="minorHAnsi" w:cstheme="minorHAnsi"/>
-          <w:sz w:val="22"/>
-          <w:szCs w:val="22"/>
-        </w:rPr>
-      </w:pPr>
+        <w:t xml:space="preserve"> Con el modelo ajustado podría evaluarse si el abandono de un programa es anticipable a partir de sus características observables, que es la pregunta que convierte el diagnóstico en un instrumento de focalización.</w:t>
+      </w:r>
     </w:p>
     <w:p>
       <w:pPr>
@@ -10301,7 +9978,6 @@
           <w:sz w:val="26"/>
           <w:szCs w:val="26"/>
         </w:rPr>
-        <w:lastRenderedPageBreak/>
         <w:t>9. Reproducibilidad</w:t>
       </w:r>
       <w:bookmarkEnd w:id="19"/>
@@ -10411,22 +10087,9 @@
           <w:szCs w:val="26"/>
           <w:lang w:val="en-US"/>
         </w:rPr>
-        <w:t xml:space="preserve">10. </w:t>
-      </w:r>
-      <w:proofErr w:type="spellStart"/>
-      <w:r>
-        <w:rPr>
-          <w:b/>
-          <w:bCs/>
-          <w:color w:val="auto"/>
-          <w:sz w:val="26"/>
-          <w:szCs w:val="26"/>
-          <w:lang w:val="en-US"/>
-        </w:rPr>
-        <w:t>Referencias</w:t>
+        <w:t>10. Referencias</w:t>
       </w:r>
       <w:bookmarkEnd w:id="20"/>
-      <w:proofErr w:type="spellEnd"/>
     </w:p>
     <w:p>
       <w:pPr>
@@ -10533,43 +10196,7 @@
           <w:szCs w:val="22"/>
           <w:lang w:val="en-US"/>
         </w:rPr>
-        <w:t xml:space="preserve">Harris, C. R., Millman, K. J., van der Walt, S. J., </w:t>
-      </w:r>
-      <w:proofErr w:type="spellStart"/>
-      <w:r>
-        <w:rPr>
-          <w:sz w:val="22"/>
-          <w:szCs w:val="22"/>
-          <w:lang w:val="en-US"/>
-        </w:rPr>
-        <w:t>Gommers</w:t>
-      </w:r>
-      <w:proofErr w:type="spellEnd"/>
-      <w:r>
-        <w:rPr>
-          <w:sz w:val="22"/>
-          <w:szCs w:val="22"/>
-          <w:lang w:val="en-US"/>
-        </w:rPr>
-        <w:t xml:space="preserve">, R., Virtanen, P., </w:t>
-      </w:r>
-      <w:proofErr w:type="spellStart"/>
-      <w:r>
-        <w:rPr>
-          <w:sz w:val="22"/>
-          <w:szCs w:val="22"/>
-          <w:lang w:val="en-US"/>
-        </w:rPr>
-        <w:t>Cournapeau</w:t>
-      </w:r>
-      <w:proofErr w:type="spellEnd"/>
-      <w:r>
-        <w:rPr>
-          <w:sz w:val="22"/>
-          <w:szCs w:val="22"/>
-          <w:lang w:val="en-US"/>
-        </w:rPr>
-        <w:t xml:space="preserve">, D. et al. </w:t>
+        <w:t xml:space="preserve">Harris, C. R., Millman, K. J., van der Walt, S. J., Gommers, R., Virtanen, P., Cournapeau, D. et al. </w:t>
       </w:r>
       <w:r>
         <w:rPr>
@@ -10662,59 +10289,13 @@
           <w:lang w:val="en-US"/>
         </w:rPr>
       </w:pPr>
-      <w:proofErr w:type="spellStart"/>
       <w:r>
         <w:rPr>
           <w:sz w:val="22"/>
           <w:szCs w:val="22"/>
           <w:lang w:val="en-US"/>
         </w:rPr>
-        <w:t>Seabold</w:t>
-      </w:r>
-      <w:proofErr w:type="spellEnd"/>
-      <w:r>
-        <w:rPr>
-          <w:sz w:val="22"/>
-          <w:szCs w:val="22"/>
-          <w:lang w:val="en-US"/>
-        </w:rPr>
-        <w:t xml:space="preserve">, S. y </w:t>
-      </w:r>
-      <w:proofErr w:type="spellStart"/>
-      <w:r>
-        <w:rPr>
-          <w:sz w:val="22"/>
-          <w:szCs w:val="22"/>
-          <w:lang w:val="en-US"/>
-        </w:rPr>
-        <w:t>Perktold</w:t>
-      </w:r>
-      <w:proofErr w:type="spellEnd"/>
-      <w:r>
-        <w:rPr>
-          <w:sz w:val="22"/>
-          <w:szCs w:val="22"/>
-          <w:lang w:val="en-US"/>
-        </w:rPr>
-        <w:t xml:space="preserve">, J. (2010). </w:t>
-      </w:r>
-      <w:proofErr w:type="spellStart"/>
-      <w:r>
-        <w:rPr>
-          <w:sz w:val="22"/>
-          <w:szCs w:val="22"/>
-          <w:lang w:val="en-US"/>
-        </w:rPr>
-        <w:t>statsmodels</w:t>
-      </w:r>
-      <w:proofErr w:type="spellEnd"/>
-      <w:r>
-        <w:rPr>
-          <w:sz w:val="22"/>
-          <w:szCs w:val="22"/>
-          <w:lang w:val="en-US"/>
-        </w:rPr>
-        <w:t xml:space="preserve">: econometric and statistical modeling with Python. En </w:t>
+        <w:t xml:space="preserve">Seabold, S. y Perktold, J. (2010). statsmodels: econometric and statistical modeling with Python. En </w:t>
       </w:r>
       <w:r>
         <w:rPr>
@@ -10882,61 +10463,7 @@
           <w:szCs w:val="22"/>
           <w:lang w:val="en-US"/>
         </w:rPr>
-        <w:t xml:space="preserve">Virtanen, P., </w:t>
-      </w:r>
-      <w:proofErr w:type="spellStart"/>
-      <w:r>
-        <w:rPr>
-          <w:sz w:val="22"/>
-          <w:szCs w:val="22"/>
-          <w:lang w:val="en-US"/>
-        </w:rPr>
-        <w:t>Gommers</w:t>
-      </w:r>
-      <w:proofErr w:type="spellEnd"/>
-      <w:r>
-        <w:rPr>
-          <w:sz w:val="22"/>
-          <w:szCs w:val="22"/>
-          <w:lang w:val="en-US"/>
-        </w:rPr>
-        <w:t xml:space="preserve">, R., Oliphant, T. E., </w:t>
-      </w:r>
-      <w:proofErr w:type="spellStart"/>
-      <w:r>
-        <w:rPr>
-          <w:sz w:val="22"/>
-          <w:szCs w:val="22"/>
-          <w:lang w:val="en-US"/>
-        </w:rPr>
-        <w:t>Haberland</w:t>
-      </w:r>
-      <w:proofErr w:type="spellEnd"/>
-      <w:r>
-        <w:rPr>
-          <w:sz w:val="22"/>
-          <w:szCs w:val="22"/>
-          <w:lang w:val="en-US"/>
-        </w:rPr>
-        <w:t xml:space="preserve">, M., Reddy, T., </w:t>
-      </w:r>
-      <w:proofErr w:type="spellStart"/>
-      <w:r>
-        <w:rPr>
-          <w:sz w:val="22"/>
-          <w:szCs w:val="22"/>
-          <w:lang w:val="en-US"/>
-        </w:rPr>
-        <w:t>Cournapeau</w:t>
-      </w:r>
-      <w:proofErr w:type="spellEnd"/>
-      <w:r>
-        <w:rPr>
-          <w:sz w:val="22"/>
-          <w:szCs w:val="22"/>
-          <w:lang w:val="en-US"/>
-        </w:rPr>
-        <w:t xml:space="preserve">, D. et al. </w:t>
+        <w:t xml:space="preserve">Virtanen, P., Gommers, R., Oliphant, T. E., Haberland, M., Reddy, T., Cournapeau, D. et al. </w:t>
       </w:r>
       <w:r>
         <w:rPr>
@@ -11038,7 +10565,6 @@
         </w:rPr>
         <w:t xml:space="preserve">Welch, B. L. (1947). The generalization of «Student’s» problem when several different population variances are involved. </w:t>
       </w:r>
-      <w:proofErr w:type="spellStart"/>
       <w:r>
         <w:rPr>
           <w:i/>
@@ -11049,7 +10575,6 @@
         </w:rPr>
         <w:t>Biometrika</w:t>
       </w:r>
-      <w:proofErr w:type="spellEnd"/>
       <w:r>
         <w:rPr>
           <w:sz w:val="22"/>
@@ -11081,7 +10606,6 @@
         </w:rPr>
         <w:t xml:space="preserve">Wilson, E. B. (1927). Probable inference, the law of succession, and statistical inference. </w:t>
       </w:r>
-      <w:proofErr w:type="spellStart"/>
       <w:r>
         <w:rPr>
           <w:i/>
@@ -11089,89 +10613,8 @@
           <w:sz w:val="22"/>
           <w:szCs w:val="22"/>
         </w:rPr>
-        <w:t>Journal</w:t>
-      </w:r>
-      <w:proofErr w:type="spellEnd"/>
-      <w:r>
-        <w:rPr>
-          <w:i/>
-          <w:iCs/>
-          <w:sz w:val="22"/>
-          <w:szCs w:val="22"/>
-        </w:rPr>
-        <w:t xml:space="preserve"> </w:t>
-      </w:r>
-      <w:proofErr w:type="spellStart"/>
-      <w:r>
-        <w:rPr>
-          <w:i/>
-          <w:iCs/>
-          <w:sz w:val="22"/>
-          <w:szCs w:val="22"/>
-        </w:rPr>
-        <w:t>of</w:t>
-      </w:r>
-      <w:proofErr w:type="spellEnd"/>
-      <w:r>
-        <w:rPr>
-          <w:i/>
-          <w:iCs/>
-          <w:sz w:val="22"/>
-          <w:szCs w:val="22"/>
-        </w:rPr>
-        <w:t xml:space="preserve"> </w:t>
-      </w:r>
-      <w:proofErr w:type="spellStart"/>
-      <w:r>
-        <w:rPr>
-          <w:i/>
-          <w:iCs/>
-          <w:sz w:val="22"/>
-          <w:szCs w:val="22"/>
-        </w:rPr>
-        <w:t>the</w:t>
-      </w:r>
-      <w:proofErr w:type="spellEnd"/>
-      <w:r>
-        <w:rPr>
-          <w:i/>
-          <w:iCs/>
-          <w:sz w:val="22"/>
-          <w:szCs w:val="22"/>
-        </w:rPr>
-        <w:t xml:space="preserve"> American </w:t>
-      </w:r>
-      <w:proofErr w:type="spellStart"/>
-      <w:r>
-        <w:rPr>
-          <w:i/>
-          <w:iCs/>
-          <w:sz w:val="22"/>
-          <w:szCs w:val="22"/>
-        </w:rPr>
-        <w:t>Statistical</w:t>
-      </w:r>
-      <w:proofErr w:type="spellEnd"/>
-      <w:r>
-        <w:rPr>
-          <w:i/>
-          <w:iCs/>
-          <w:sz w:val="22"/>
-          <w:szCs w:val="22"/>
-        </w:rPr>
-        <w:t xml:space="preserve"> </w:t>
-      </w:r>
-      <w:proofErr w:type="spellStart"/>
-      <w:r>
-        <w:rPr>
-          <w:i/>
-          <w:iCs/>
-          <w:sz w:val="22"/>
-          <w:szCs w:val="22"/>
-        </w:rPr>
-        <w:t>Association</w:t>
-      </w:r>
-      <w:proofErr w:type="spellEnd"/>
+        <w:t>Journal of the American Statistical Association</w:t>
+      </w:r>
       <w:r>
         <w:rPr>
           <w:sz w:val="22"/>

</xml_diff>

<commit_message>
docs: agrega el indice al informe
</commit_message>
<xml_diff>
--- a/informe/Sumativa1_Informe_Maria_Fassler_Sebastian_Antunez.docx
+++ b/informe/Sumativa1_Informe_Maria_Fassler_Sebastian_Antunez.docx
@@ -202,7 +202,25 @@
           <w:sz w:val="24"/>
           <w:szCs w:val="24"/>
         </w:rPr>
-        <w:t>María Fassler Neumann / Sebastian Antunez Noguera</w:t>
+        <w:t xml:space="preserve">María </w:t>
+      </w:r>
+      <w:proofErr w:type="spellStart"/>
+      <w:r>
+        <w:rPr>
+          <w:rFonts w:ascii="Arial" w:eastAsia="Arial" w:hAnsi="Arial" w:cs="Arial"/>
+          <w:sz w:val="24"/>
+          <w:szCs w:val="24"/>
+        </w:rPr>
+        <w:t>Fassler</w:t>
+      </w:r>
+      <w:proofErr w:type="spellEnd"/>
+      <w:r>
+        <w:rPr>
+          <w:rFonts w:ascii="Arial" w:eastAsia="Arial" w:hAnsi="Arial" w:cs="Arial"/>
+          <w:sz w:val="24"/>
+          <w:szCs w:val="24"/>
+        </w:rPr>
+        <w:t xml:space="preserve"> Neumann / Sebastian Antunez Noguera</w:t>
       </w:r>
     </w:p>
     <w:p>
@@ -2624,8 +2642,49 @@
                 <w:sz w:val="17"/>
                 <w:szCs w:val="17"/>
               </w:rPr>
-              <w:t>abandono (respuesta), inst_acreditada, pct_mujeres, edad_promedio</w:t>
-            </w:r>
+              <w:t xml:space="preserve">abandono (respuesta), </w:t>
+            </w:r>
+            <w:proofErr w:type="spellStart"/>
+            <w:r>
+              <w:rPr>
+                <w:sz w:val="17"/>
+                <w:szCs w:val="17"/>
+              </w:rPr>
+              <w:t>inst_acreditada</w:t>
+            </w:r>
+            <w:proofErr w:type="spellEnd"/>
+            <w:r>
+              <w:rPr>
+                <w:sz w:val="17"/>
+                <w:szCs w:val="17"/>
+              </w:rPr>
+              <w:t xml:space="preserve">, </w:t>
+            </w:r>
+            <w:proofErr w:type="spellStart"/>
+            <w:r>
+              <w:rPr>
+                <w:sz w:val="17"/>
+                <w:szCs w:val="17"/>
+              </w:rPr>
+              <w:t>pct_mujeres</w:t>
+            </w:r>
+            <w:proofErr w:type="spellEnd"/>
+            <w:r>
+              <w:rPr>
+                <w:sz w:val="17"/>
+                <w:szCs w:val="17"/>
+              </w:rPr>
+              <w:t xml:space="preserve">, </w:t>
+            </w:r>
+            <w:proofErr w:type="spellStart"/>
+            <w:r>
+              <w:rPr>
+                <w:sz w:val="17"/>
+                <w:szCs w:val="17"/>
+              </w:rPr>
+              <w:t>edad_promedio</w:t>
+            </w:r>
+            <w:proofErr w:type="spellEnd"/>
           </w:p>
         </w:tc>
       </w:tr>
@@ -2689,8 +2748,17 @@
                 <w:sz w:val="17"/>
                 <w:szCs w:val="17"/>
               </w:rPr>
-              <w:t>ingreso, titulados, duracion_estudio_carrera</w:t>
-            </w:r>
+              <w:t xml:space="preserve">ingreso, titulados, </w:t>
+            </w:r>
+            <w:proofErr w:type="spellStart"/>
+            <w:r>
+              <w:rPr>
+                <w:sz w:val="17"/>
+                <w:szCs w:val="17"/>
+              </w:rPr>
+              <w:t>duracion_estudio_carrera</w:t>
+            </w:r>
+            <w:proofErr w:type="spellEnd"/>
           </w:p>
         </w:tc>
       </w:tr>
@@ -2819,8 +2887,17 @@
                 <w:sz w:val="17"/>
                 <w:szCs w:val="17"/>
               </w:rPr>
-              <w:t>metropolitana, inst_cerrada</w:t>
-            </w:r>
+              <w:t xml:space="preserve">metropolitana, </w:t>
+            </w:r>
+            <w:proofErr w:type="spellStart"/>
+            <w:r>
+              <w:rPr>
+                <w:sz w:val="17"/>
+                <w:szCs w:val="17"/>
+              </w:rPr>
+              <w:t>inst_cerrada</w:t>
+            </w:r>
+            <w:proofErr w:type="spellEnd"/>
           </w:p>
         </w:tc>
       </w:tr>
@@ -2879,13 +2956,31 @@
             </w:tcMar>
           </w:tcPr>
           <w:p>
-            <w:r>
-              <w:rPr>
-                <w:sz w:val="17"/>
-                <w:szCs w:val="17"/>
-              </w:rPr>
-              <w:t>codigo_carrera, codigo_de_institucion</w:t>
-            </w:r>
+            <w:proofErr w:type="spellStart"/>
+            <w:r>
+              <w:rPr>
+                <w:sz w:val="17"/>
+                <w:szCs w:val="17"/>
+              </w:rPr>
+              <w:t>codigo_carrera</w:t>
+            </w:r>
+            <w:proofErr w:type="spellEnd"/>
+            <w:r>
+              <w:rPr>
+                <w:sz w:val="17"/>
+                <w:szCs w:val="17"/>
+              </w:rPr>
+              <w:t xml:space="preserve">, </w:t>
+            </w:r>
+            <w:proofErr w:type="spellStart"/>
+            <w:r>
+              <w:rPr>
+                <w:sz w:val="17"/>
+                <w:szCs w:val="17"/>
+              </w:rPr>
+              <w:t>codigo_de_institucion</w:t>
+            </w:r>
+            <w:proofErr w:type="spellEnd"/>
           </w:p>
         </w:tc>
       </w:tr>
@@ -2909,7 +3004,29 @@
           <w:szCs w:val="17"/>
         </w:rPr>
         <w:lastRenderedPageBreak/>
-        <w:t>Conviene advertir que inst_acreditada parece dicotómica y no lo es: toma 1.195 valores distintos entre 0 y 1 porque promedia el estado de acreditación a lo largo de los años de cohorte. Por eso los contrastes del apartado 5 comparan los dos extremos inequívocos —siempre acreditada (7.672 programas) frente a nunca acreditada (757)— y excluyen los 1.249 programas en transición.</w:t>
+        <w:t xml:space="preserve">Conviene advertir que </w:t>
+      </w:r>
+      <w:proofErr w:type="spellStart"/>
+      <w:r>
+        <w:rPr>
+          <w:i/>
+          <w:iCs/>
+          <w:color w:val="444444"/>
+          <w:sz w:val="17"/>
+          <w:szCs w:val="17"/>
+        </w:rPr>
+        <w:t>inst_acreditada</w:t>
+      </w:r>
+      <w:proofErr w:type="spellEnd"/>
+      <w:r>
+        <w:rPr>
+          <w:i/>
+          <w:iCs/>
+          <w:color w:val="444444"/>
+          <w:sz w:val="17"/>
+          <w:szCs w:val="17"/>
+        </w:rPr>
+        <w:t xml:space="preserve"> parece dicotómica y no lo es: toma 1.195 valores distintos entre 0 y 1 porque promedia el estado de acreditación a lo largo de los años de cohorte. Por eso los contrastes del apartado 5 comparan los dos extremos inequívocos —siempre acreditada (7.672 programas) frente a nunca acreditada (757)— y excluyen los 1.249 programas en transición.</w:t>
       </w:r>
     </w:p>
     <w:p>
@@ -4246,12 +4363,21 @@
             </w:tcMar>
           </w:tcPr>
           <w:p>
-            <w:r>
-              <w:rPr>
-                <w:sz w:val="17"/>
-                <w:szCs w:val="17"/>
-              </w:rPr>
-              <w:t>Coef. de variación</w:t>
+            <w:proofErr w:type="spellStart"/>
+            <w:r>
+              <w:rPr>
+                <w:sz w:val="17"/>
+                <w:szCs w:val="17"/>
+              </w:rPr>
+              <w:t>Coef</w:t>
+            </w:r>
+            <w:proofErr w:type="spellEnd"/>
+            <w:r>
+              <w:rPr>
+                <w:sz w:val="17"/>
+                <w:szCs w:val="17"/>
+              </w:rPr>
+              <w:t>. de variación</w:t>
             </w:r>
           </w:p>
         </w:tc>
@@ -7855,7 +7981,39 @@
                 <w:sz w:val="17"/>
                 <w:szCs w:val="17"/>
               </w:rPr>
-              <w:t>t de Student, gl = 9.677</w:t>
+              <w:t xml:space="preserve">t de </w:t>
+            </w:r>
+            <w:proofErr w:type="spellStart"/>
+            <w:r>
+              <w:rPr>
+                <w:sz w:val="17"/>
+                <w:szCs w:val="17"/>
+              </w:rPr>
+              <w:t>Student</w:t>
+            </w:r>
+            <w:proofErr w:type="spellEnd"/>
+            <w:r>
+              <w:rPr>
+                <w:sz w:val="17"/>
+                <w:szCs w:val="17"/>
+              </w:rPr>
+              <w:t xml:space="preserve">, </w:t>
+            </w:r>
+            <w:proofErr w:type="spellStart"/>
+            <w:r>
+              <w:rPr>
+                <w:sz w:val="17"/>
+                <w:szCs w:val="17"/>
+              </w:rPr>
+              <w:t>gl</w:t>
+            </w:r>
+            <w:proofErr w:type="spellEnd"/>
+            <w:r>
+              <w:rPr>
+                <w:sz w:val="17"/>
+                <w:szCs w:val="17"/>
+              </w:rPr>
+              <w:t xml:space="preserve"> = 9.677</w:t>
             </w:r>
           </w:p>
         </w:tc>
@@ -7957,7 +8115,39 @@
                 <w:sz w:val="17"/>
                 <w:szCs w:val="17"/>
               </w:rPr>
-              <w:t>t de Student, gl = 9.677</w:t>
+              <w:t xml:space="preserve">t de </w:t>
+            </w:r>
+            <w:proofErr w:type="spellStart"/>
+            <w:r>
+              <w:rPr>
+                <w:sz w:val="17"/>
+                <w:szCs w:val="17"/>
+              </w:rPr>
+              <w:t>Student</w:t>
+            </w:r>
+            <w:proofErr w:type="spellEnd"/>
+            <w:r>
+              <w:rPr>
+                <w:sz w:val="17"/>
+                <w:szCs w:val="17"/>
+              </w:rPr>
+              <w:t xml:space="preserve">, </w:t>
+            </w:r>
+            <w:proofErr w:type="spellStart"/>
+            <w:r>
+              <w:rPr>
+                <w:sz w:val="17"/>
+                <w:szCs w:val="17"/>
+              </w:rPr>
+              <w:t>gl</w:t>
+            </w:r>
+            <w:proofErr w:type="spellEnd"/>
+            <w:r>
+              <w:rPr>
+                <w:sz w:val="17"/>
+                <w:szCs w:val="17"/>
+              </w:rPr>
+              <w:t xml:space="preserve"> = 9.677</w:t>
             </w:r>
           </w:p>
         </w:tc>
@@ -8059,7 +8249,39 @@
                 <w:sz w:val="17"/>
                 <w:szCs w:val="17"/>
               </w:rPr>
-              <w:t>t de Student, gl = 9.677</w:t>
+              <w:t xml:space="preserve">t de </w:t>
+            </w:r>
+            <w:proofErr w:type="spellStart"/>
+            <w:r>
+              <w:rPr>
+                <w:sz w:val="17"/>
+                <w:szCs w:val="17"/>
+              </w:rPr>
+              <w:t>Student</w:t>
+            </w:r>
+            <w:proofErr w:type="spellEnd"/>
+            <w:r>
+              <w:rPr>
+                <w:sz w:val="17"/>
+                <w:szCs w:val="17"/>
+              </w:rPr>
+              <w:t xml:space="preserve">, </w:t>
+            </w:r>
+            <w:proofErr w:type="spellStart"/>
+            <w:r>
+              <w:rPr>
+                <w:sz w:val="17"/>
+                <w:szCs w:val="17"/>
+              </w:rPr>
+              <w:t>gl</w:t>
+            </w:r>
+            <w:proofErr w:type="spellEnd"/>
+            <w:r>
+              <w:rPr>
+                <w:sz w:val="17"/>
+                <w:szCs w:val="17"/>
+              </w:rPr>
+              <w:t xml:space="preserve"> = 9.677</w:t>
             </w:r>
           </w:p>
         </w:tc>
@@ -8263,7 +8485,23 @@
                 <w:sz w:val="17"/>
                 <w:szCs w:val="17"/>
               </w:rPr>
-              <w:t>Welch, gl = 902</w:t>
+              <w:t xml:space="preserve">Welch, </w:t>
+            </w:r>
+            <w:proofErr w:type="spellStart"/>
+            <w:r>
+              <w:rPr>
+                <w:sz w:val="17"/>
+                <w:szCs w:val="17"/>
+              </w:rPr>
+              <w:t>gl</w:t>
+            </w:r>
+            <w:proofErr w:type="spellEnd"/>
+            <w:r>
+              <w:rPr>
+                <w:sz w:val="17"/>
+                <w:szCs w:val="17"/>
+              </w:rPr>
+              <w:t xml:space="preserve"> = 902</w:t>
             </w:r>
           </w:p>
         </w:tc>
@@ -8381,7 +8619,39 @@
           <w:sz w:val="22"/>
           <w:szCs w:val="22"/>
         </w:rPr>
-        <w:t>l error estándar divide la desviación por la raíz de 9.678, es decir por 98,4. Conviene no confundir precisión con homogeneidad: el intervalo describe cuán bien conocemos el promedio, no cuán parecidos son los programas entre sí. Un remuestreo bootstrap de 5.000 réplicas arroja [0,</w:t>
+        <w:t xml:space="preserve">l error estándar divide la desviación por la raíz de 9.678, es decir por 98,4. Conviene no confundir precisión con homogeneidad: el intervalo describe cuán bien conocemos el promedio, no cuán parecidos son los programas entre sí. Un </w:t>
+      </w:r>
+      <w:proofErr w:type="spellStart"/>
+      <w:r>
+        <w:rPr>
+          <w:sz w:val="22"/>
+          <w:szCs w:val="22"/>
+        </w:rPr>
+        <w:t>remuestreo</w:t>
+      </w:r>
+      <w:proofErr w:type="spellEnd"/>
+      <w:r>
+        <w:rPr>
+          <w:sz w:val="22"/>
+          <w:szCs w:val="22"/>
+        </w:rPr>
+        <w:t xml:space="preserve"> </w:t>
+      </w:r>
+      <w:proofErr w:type="spellStart"/>
+      <w:r>
+        <w:rPr>
+          <w:sz w:val="22"/>
+          <w:szCs w:val="22"/>
+        </w:rPr>
+        <w:t>bootstrap</w:t>
+      </w:r>
+      <w:proofErr w:type="spellEnd"/>
+      <w:r>
+        <w:rPr>
+          <w:sz w:val="22"/>
+          <w:szCs w:val="22"/>
+        </w:rPr>
+        <w:t xml:space="preserve"> de 5.000 réplicas arroja [0,</w:t>
       </w:r>
       <w:r>
         <w:rPr>
@@ -8958,7 +9228,23 @@
                 <w:sz w:val="17"/>
                 <w:szCs w:val="17"/>
               </w:rPr>
-              <w:t>t = 8,04 (gl = 9.677)</w:t>
+              <w:t>t = 8,04 (</w:t>
+            </w:r>
+            <w:proofErr w:type="spellStart"/>
+            <w:r>
+              <w:rPr>
+                <w:sz w:val="17"/>
+                <w:szCs w:val="17"/>
+              </w:rPr>
+              <w:t>gl</w:t>
+            </w:r>
+            <w:proofErr w:type="spellEnd"/>
+            <w:r>
+              <w:rPr>
+                <w:sz w:val="17"/>
+                <w:szCs w:val="17"/>
+              </w:rPr>
+              <w:t xml:space="preserve"> = 9.677)</w:t>
             </w:r>
           </w:p>
         </w:tc>
@@ -9174,7 +9460,23 @@
                 <w:sz w:val="17"/>
                 <w:szCs w:val="17"/>
               </w:rPr>
-              <w:t>t = 20,61 (gl = 902)</w:t>
+              <w:t>t = 20,61 (</w:t>
+            </w:r>
+            <w:proofErr w:type="spellStart"/>
+            <w:r>
+              <w:rPr>
+                <w:sz w:val="17"/>
+                <w:szCs w:val="17"/>
+              </w:rPr>
+              <w:t>gl</w:t>
+            </w:r>
+            <w:proofErr w:type="spellEnd"/>
+            <w:r>
+              <w:rPr>
+                <w:sz w:val="17"/>
+                <w:szCs w:val="17"/>
+              </w:rPr>
+              <w:t xml:space="preserve"> = 902)</w:t>
             </w:r>
           </w:p>
         </w:tc>
@@ -9282,7 +9584,23 @@
                 <w:sz w:val="17"/>
                 <w:szCs w:val="17"/>
               </w:rPr>
-              <w:t>F = 44,30 (gl = 9; 9.668)</w:t>
+              <w:t>F = 44,30 (</w:t>
+            </w:r>
+            <w:proofErr w:type="spellStart"/>
+            <w:r>
+              <w:rPr>
+                <w:sz w:val="17"/>
+                <w:szCs w:val="17"/>
+              </w:rPr>
+              <w:t>gl</w:t>
+            </w:r>
+            <w:proofErr w:type="spellEnd"/>
+            <w:r>
+              <w:rPr>
+                <w:sz w:val="17"/>
+                <w:szCs w:val="17"/>
+              </w:rPr>
+              <w:t xml:space="preserve"> = 9; 9.668)</w:t>
             </w:r>
           </w:p>
         </w:tc>
@@ -9390,7 +9708,23 @@
                 <w:sz w:val="17"/>
                 <w:szCs w:val="17"/>
               </w:rPr>
-              <w:t>χ² = 102,51 (gl = 5)</w:t>
+              <w:t>χ² = 102,51 (</w:t>
+            </w:r>
+            <w:proofErr w:type="spellStart"/>
+            <w:r>
+              <w:rPr>
+                <w:sz w:val="17"/>
+                <w:szCs w:val="17"/>
+              </w:rPr>
+              <w:t>gl</w:t>
+            </w:r>
+            <w:proofErr w:type="spellEnd"/>
+            <w:r>
+              <w:rPr>
+                <w:sz w:val="17"/>
+                <w:szCs w:val="17"/>
+              </w:rPr>
+              <w:t xml:space="preserve"> = 5)</w:t>
             </w:r>
           </w:p>
         </w:tc>
@@ -9433,7 +9767,23 @@
                 <w:sz w:val="17"/>
                 <w:szCs w:val="17"/>
               </w:rPr>
-              <w:t>V de Cramér = 0,103 — débil</w:t>
+              <w:t xml:space="preserve">V de </w:t>
+            </w:r>
+            <w:proofErr w:type="spellStart"/>
+            <w:r>
+              <w:rPr>
+                <w:sz w:val="17"/>
+                <w:szCs w:val="17"/>
+              </w:rPr>
+              <w:t>Cramér</w:t>
+            </w:r>
+            <w:proofErr w:type="spellEnd"/>
+            <w:r>
+              <w:rPr>
+                <w:sz w:val="17"/>
+                <w:szCs w:val="17"/>
+              </w:rPr>
+              <w:t xml:space="preserve"> = 0,103 — débil</w:t>
             </w:r>
           </w:p>
         </w:tc>
@@ -9489,7 +9839,23 @@
           <w:sz w:val="22"/>
           <w:szCs w:val="22"/>
         </w:rPr>
-        <w:t xml:space="preserve"> la acreditación no solo distingue grupos de forma detectable, sino de forma sustantiva. El área del conocimiento, en cambio, explica apenas el 4 % de la varianza del abandono, y el tipo de institución arroja una asociación que la V de Cramér (1946) califica de débil, coherente con el solapamiento que ya mostraba la figura 3.</w:t>
+        <w:t xml:space="preserve"> la acreditación no solo distingue grupos de forma detectable, sino de forma sustantiva. El área del conocimiento, en cambio, explica apenas el 4 % de la varianza del abandono, y el tipo de institución arroja una asociación que la V de </w:t>
+      </w:r>
+      <w:proofErr w:type="spellStart"/>
+      <w:r>
+        <w:rPr>
+          <w:sz w:val="22"/>
+          <w:szCs w:val="22"/>
+        </w:rPr>
+        <w:t>Cramér</w:t>
+      </w:r>
+      <w:proofErr w:type="spellEnd"/>
+      <w:r>
+        <w:rPr>
+          <w:sz w:val="22"/>
+          <w:szCs w:val="22"/>
+        </w:rPr>
+        <w:t xml:space="preserve"> (1946) califica de débil, coherente con el solapamiento que ya mostraba la figura 3.</w:t>
       </w:r>
     </w:p>
     <w:p>
@@ -9520,7 +9886,55 @@
           <w:sz w:val="22"/>
           <w:szCs w:val="22"/>
         </w:rPr>
-        <w:t>los cinco contrastes rechazan con valores entre 10⁻¹⁵ y 10⁻⁷⁸, y aun así sus efectos recorren toda la escala, de grande (d = 0,80) a despreciable (d = 0,082). Informar solo la significación llevaría a tratar los tres resultados como equivalentes, que es exactamente el error que una decisión de focalización no puede permitirse. La advertencia es la misma que formula la American Statistical Association al recordar que un valor p, por sí solo, no mide la magnitud de un efecto ni su relevancia práctica (Wasserstein y Lazar, 2016).</w:t>
+        <w:t xml:space="preserve">los cinco contrastes rechazan con valores entre 10⁻¹⁵ y 10⁻⁷⁸, y aun así sus efectos recorren toda la escala, de grande (d = 0,80) a despreciable (d = 0,082). Informar solo la significación llevaría a tratar los tres resultados como equivalentes, que es exactamente el error que una decisión de focalización no puede permitirse. La advertencia es la misma que formula la American </w:t>
+      </w:r>
+      <w:proofErr w:type="spellStart"/>
+      <w:r>
+        <w:rPr>
+          <w:sz w:val="22"/>
+          <w:szCs w:val="22"/>
+        </w:rPr>
+        <w:t>Statistical</w:t>
+      </w:r>
+      <w:proofErr w:type="spellEnd"/>
+      <w:r>
+        <w:rPr>
+          <w:sz w:val="22"/>
+          <w:szCs w:val="22"/>
+        </w:rPr>
+        <w:t xml:space="preserve"> </w:t>
+      </w:r>
+      <w:proofErr w:type="spellStart"/>
+      <w:r>
+        <w:rPr>
+          <w:sz w:val="22"/>
+          <w:szCs w:val="22"/>
+        </w:rPr>
+        <w:t>Association</w:t>
+      </w:r>
+      <w:proofErr w:type="spellEnd"/>
+      <w:r>
+        <w:rPr>
+          <w:sz w:val="22"/>
+          <w:szCs w:val="22"/>
+        </w:rPr>
+        <w:t xml:space="preserve"> al recordar que un valor p, por sí solo, no mide la magnitud de un efecto ni su relevancia práctica (</w:t>
+      </w:r>
+      <w:proofErr w:type="spellStart"/>
+      <w:r>
+        <w:rPr>
+          <w:sz w:val="22"/>
+          <w:szCs w:val="22"/>
+        </w:rPr>
+        <w:t>Wasserstein</w:t>
+      </w:r>
+      <w:proofErr w:type="spellEnd"/>
+      <w:r>
+        <w:rPr>
+          <w:sz w:val="22"/>
+          <w:szCs w:val="22"/>
+        </w:rPr>
+        <w:t xml:space="preserve"> y Lazar, 2016).</w:t>
       </w:r>
     </w:p>
     <w:p>
@@ -9756,7 +10170,25 @@
           <w:sz w:val="22"/>
           <w:szCs w:val="22"/>
         </w:rPr>
-        <w:t>no hay grupo de control ni asignación aleatoria, y la acreditación podría estar recogiendo el efecto de la selectividad del ingreso o de los recursos de la institución. La ventana temporal trunca las cohortes recientes, cuyo abandono aparente queda inflado. Y los contrastes son univariados, de modo que los efectos podrían estar confundidos entre sí; un modelo multivariado, previsto para la fase siguiente, permitiría estimar cada efecto manteniendo las demás constantes.</w:t>
+        <w:t xml:space="preserve">no hay grupo de control ni asignación aleatoria, y la acreditación podría estar recogiendo el efecto de la selectividad del ingreso o de los recursos de la institución. La ventana temporal trunca las cohortes recientes, cuyo abandono aparente queda inflado. Y los contrastes son </w:t>
+      </w:r>
+      <w:proofErr w:type="spellStart"/>
+      <w:r>
+        <w:rPr>
+          <w:rFonts w:asciiTheme="minorHAnsi" w:hAnsiTheme="minorHAnsi" w:cstheme="minorHAnsi"/>
+          <w:sz w:val="22"/>
+          <w:szCs w:val="22"/>
+        </w:rPr>
+        <w:t>univariados</w:t>
+      </w:r>
+      <w:proofErr w:type="spellEnd"/>
+      <w:r>
+        <w:rPr>
+          <w:rFonts w:asciiTheme="minorHAnsi" w:hAnsiTheme="minorHAnsi" w:cstheme="minorHAnsi"/>
+          <w:sz w:val="22"/>
+          <w:szCs w:val="22"/>
+        </w:rPr>
+        <w:t>, de modo que los efectos podrían estar confundidos entre sí; un modelo multivariado, previsto para la fase siguiente, permitiría estimar cada efecto manteniendo las demás constantes.</w:t>
       </w:r>
     </w:p>
     <w:p>
@@ -9796,8 +10228,18 @@
           <w:sz w:val="22"/>
           <w:szCs w:val="22"/>
         </w:rPr>
-        <w:t>El análisis realizado es univariado</w:t>
-      </w:r>
+        <w:t xml:space="preserve">El análisis realizado es </w:t>
+      </w:r>
+      <w:proofErr w:type="spellStart"/>
+      <w:r>
+        <w:rPr>
+          <w:rFonts w:asciiTheme="minorHAnsi" w:hAnsiTheme="minorHAnsi" w:cstheme="minorHAnsi"/>
+          <w:sz w:val="22"/>
+          <w:szCs w:val="22"/>
+        </w:rPr>
+        <w:t>univariado</w:t>
+      </w:r>
+      <w:proofErr w:type="spellEnd"/>
       <w:r>
         <w:rPr>
           <w:rFonts w:asciiTheme="minorHAnsi" w:hAnsiTheme="minorHAnsi" w:cstheme="minorHAnsi"/>
@@ -9958,7 +10400,25 @@
           <w:sz w:val="22"/>
           <w:szCs w:val="22"/>
         </w:rPr>
-        <w:t xml:space="preserve"> Con el modelo ajustado podría evaluarse si el abandono de un programa es anticipable a partir de sus características observables, que es la pregunta que convierte el diagnóstico en un instrumento de focalización.</w:t>
+        <w:t xml:space="preserve"> Con el modelo ajustado podría evaluarse si el abandono de un programa es </w:t>
+      </w:r>
+      <w:proofErr w:type="spellStart"/>
+      <w:r>
+        <w:rPr>
+          <w:rFonts w:asciiTheme="minorHAnsi" w:hAnsiTheme="minorHAnsi" w:cstheme="minorHAnsi"/>
+          <w:sz w:val="22"/>
+          <w:szCs w:val="22"/>
+        </w:rPr>
+        <w:t>anticipable</w:t>
+      </w:r>
+      <w:proofErr w:type="spellEnd"/>
+      <w:r>
+        <w:rPr>
+          <w:rFonts w:asciiTheme="minorHAnsi" w:hAnsiTheme="minorHAnsi" w:cstheme="minorHAnsi"/>
+          <w:sz w:val="22"/>
+          <w:szCs w:val="22"/>
+        </w:rPr>
+        <w:t xml:space="preserve"> a partir de sus características observables, que es la pregunta que convierte el diagnóstico en un instrumento de focalización.</w:t>
       </w:r>
     </w:p>
     <w:p>
@@ -10087,9 +10547,22 @@
           <w:szCs w:val="26"/>
           <w:lang w:val="en-US"/>
         </w:rPr>
-        <w:t>10. Referencias</w:t>
+        <w:t xml:space="preserve">10. </w:t>
+      </w:r>
+      <w:proofErr w:type="spellStart"/>
+      <w:r>
+        <w:rPr>
+          <w:b/>
+          <w:bCs/>
+          <w:color w:val="auto"/>
+          <w:sz w:val="26"/>
+          <w:szCs w:val="26"/>
+          <w:lang w:val="en-US"/>
+        </w:rPr>
+        <w:t>Referencias</w:t>
       </w:r>
       <w:bookmarkEnd w:id="20"/>
+      <w:proofErr w:type="spellEnd"/>
     </w:p>
     <w:p>
       <w:pPr>
@@ -10196,7 +10669,43 @@
           <w:szCs w:val="22"/>
           <w:lang w:val="en-US"/>
         </w:rPr>
-        <w:t xml:space="preserve">Harris, C. R., Millman, K. J., van der Walt, S. J., Gommers, R., Virtanen, P., Cournapeau, D. et al. </w:t>
+        <w:t xml:space="preserve">Harris, C. R., Millman, K. J., van der Walt, S. J., </w:t>
+      </w:r>
+      <w:proofErr w:type="spellStart"/>
+      <w:r>
+        <w:rPr>
+          <w:sz w:val="22"/>
+          <w:szCs w:val="22"/>
+          <w:lang w:val="en-US"/>
+        </w:rPr>
+        <w:t>Gommers</w:t>
+      </w:r>
+      <w:proofErr w:type="spellEnd"/>
+      <w:r>
+        <w:rPr>
+          <w:sz w:val="22"/>
+          <w:szCs w:val="22"/>
+          <w:lang w:val="en-US"/>
+        </w:rPr>
+        <w:t xml:space="preserve">, R., Virtanen, P., </w:t>
+      </w:r>
+      <w:proofErr w:type="spellStart"/>
+      <w:r>
+        <w:rPr>
+          <w:sz w:val="22"/>
+          <w:szCs w:val="22"/>
+          <w:lang w:val="en-US"/>
+        </w:rPr>
+        <w:t>Cournapeau</w:t>
+      </w:r>
+      <w:proofErr w:type="spellEnd"/>
+      <w:r>
+        <w:rPr>
+          <w:sz w:val="22"/>
+          <w:szCs w:val="22"/>
+          <w:lang w:val="en-US"/>
+        </w:rPr>
+        <w:t xml:space="preserve">, D. et al. </w:t>
       </w:r>
       <w:r>
         <w:rPr>
@@ -10289,13 +10798,59 @@
           <w:lang w:val="en-US"/>
         </w:rPr>
       </w:pPr>
+      <w:proofErr w:type="spellStart"/>
       <w:r>
         <w:rPr>
           <w:sz w:val="22"/>
           <w:szCs w:val="22"/>
           <w:lang w:val="en-US"/>
         </w:rPr>
-        <w:t xml:space="preserve">Seabold, S. y Perktold, J. (2010). statsmodels: econometric and statistical modeling with Python. En </w:t>
+        <w:t>Seabold</w:t>
+      </w:r>
+      <w:proofErr w:type="spellEnd"/>
+      <w:r>
+        <w:rPr>
+          <w:sz w:val="22"/>
+          <w:szCs w:val="22"/>
+          <w:lang w:val="en-US"/>
+        </w:rPr>
+        <w:t xml:space="preserve">, S. y </w:t>
+      </w:r>
+      <w:proofErr w:type="spellStart"/>
+      <w:r>
+        <w:rPr>
+          <w:sz w:val="22"/>
+          <w:szCs w:val="22"/>
+          <w:lang w:val="en-US"/>
+        </w:rPr>
+        <w:t>Perktold</w:t>
+      </w:r>
+      <w:proofErr w:type="spellEnd"/>
+      <w:r>
+        <w:rPr>
+          <w:sz w:val="22"/>
+          <w:szCs w:val="22"/>
+          <w:lang w:val="en-US"/>
+        </w:rPr>
+        <w:t xml:space="preserve">, J. (2010). </w:t>
+      </w:r>
+      <w:proofErr w:type="spellStart"/>
+      <w:r>
+        <w:rPr>
+          <w:sz w:val="22"/>
+          <w:szCs w:val="22"/>
+          <w:lang w:val="en-US"/>
+        </w:rPr>
+        <w:t>statsmodels</w:t>
+      </w:r>
+      <w:proofErr w:type="spellEnd"/>
+      <w:r>
+        <w:rPr>
+          <w:sz w:val="22"/>
+          <w:szCs w:val="22"/>
+          <w:lang w:val="en-US"/>
+        </w:rPr>
+        <w:t xml:space="preserve">: econometric and statistical modeling with Python. En </w:t>
       </w:r>
       <w:r>
         <w:rPr>
@@ -10463,7 +11018,61 @@
           <w:szCs w:val="22"/>
           <w:lang w:val="en-US"/>
         </w:rPr>
-        <w:t xml:space="preserve">Virtanen, P., Gommers, R., Oliphant, T. E., Haberland, M., Reddy, T., Cournapeau, D. et al. </w:t>
+        <w:t xml:space="preserve">Virtanen, P., </w:t>
+      </w:r>
+      <w:proofErr w:type="spellStart"/>
+      <w:r>
+        <w:rPr>
+          <w:sz w:val="22"/>
+          <w:szCs w:val="22"/>
+          <w:lang w:val="en-US"/>
+        </w:rPr>
+        <w:t>Gommers</w:t>
+      </w:r>
+      <w:proofErr w:type="spellEnd"/>
+      <w:r>
+        <w:rPr>
+          <w:sz w:val="22"/>
+          <w:szCs w:val="22"/>
+          <w:lang w:val="en-US"/>
+        </w:rPr>
+        <w:t xml:space="preserve">, R., Oliphant, T. E., </w:t>
+      </w:r>
+      <w:proofErr w:type="spellStart"/>
+      <w:r>
+        <w:rPr>
+          <w:sz w:val="22"/>
+          <w:szCs w:val="22"/>
+          <w:lang w:val="en-US"/>
+        </w:rPr>
+        <w:t>Haberland</w:t>
+      </w:r>
+      <w:proofErr w:type="spellEnd"/>
+      <w:r>
+        <w:rPr>
+          <w:sz w:val="22"/>
+          <w:szCs w:val="22"/>
+          <w:lang w:val="en-US"/>
+        </w:rPr>
+        <w:t xml:space="preserve">, M., Reddy, T., </w:t>
+      </w:r>
+      <w:proofErr w:type="spellStart"/>
+      <w:r>
+        <w:rPr>
+          <w:sz w:val="22"/>
+          <w:szCs w:val="22"/>
+          <w:lang w:val="en-US"/>
+        </w:rPr>
+        <w:t>Cournapeau</w:t>
+      </w:r>
+      <w:proofErr w:type="spellEnd"/>
+      <w:r>
+        <w:rPr>
+          <w:sz w:val="22"/>
+          <w:szCs w:val="22"/>
+          <w:lang w:val="en-US"/>
+        </w:rPr>
+        <w:t xml:space="preserve">, D. et al. </w:t>
       </w:r>
       <w:r>
         <w:rPr>
@@ -10565,6 +11174,7 @@
         </w:rPr>
         <w:t xml:space="preserve">Welch, B. L. (1947). The generalization of «Student’s» problem when several different population variances are involved. </w:t>
       </w:r>
+      <w:proofErr w:type="spellStart"/>
       <w:r>
         <w:rPr>
           <w:i/>
@@ -10575,6 +11185,7 @@
         </w:rPr>
         <w:t>Biometrika</w:t>
       </w:r>
+      <w:proofErr w:type="spellEnd"/>
       <w:r>
         <w:rPr>
           <w:sz w:val="22"/>
@@ -10606,6 +11217,7 @@
         </w:rPr>
         <w:t xml:space="preserve">Wilson, E. B. (1927). Probable inference, the law of succession, and statistical inference. </w:t>
       </w:r>
+      <w:proofErr w:type="spellStart"/>
       <w:r>
         <w:rPr>
           <w:i/>
@@ -10613,8 +11225,89 @@
           <w:sz w:val="22"/>
           <w:szCs w:val="22"/>
         </w:rPr>
-        <w:t>Journal of the American Statistical Association</w:t>
-      </w:r>
+        <w:t>Journal</w:t>
+      </w:r>
+      <w:proofErr w:type="spellEnd"/>
+      <w:r>
+        <w:rPr>
+          <w:i/>
+          <w:iCs/>
+          <w:sz w:val="22"/>
+          <w:szCs w:val="22"/>
+        </w:rPr>
+        <w:t xml:space="preserve"> </w:t>
+      </w:r>
+      <w:proofErr w:type="spellStart"/>
+      <w:r>
+        <w:rPr>
+          <w:i/>
+          <w:iCs/>
+          <w:sz w:val="22"/>
+          <w:szCs w:val="22"/>
+        </w:rPr>
+        <w:t>of</w:t>
+      </w:r>
+      <w:proofErr w:type="spellEnd"/>
+      <w:r>
+        <w:rPr>
+          <w:i/>
+          <w:iCs/>
+          <w:sz w:val="22"/>
+          <w:szCs w:val="22"/>
+        </w:rPr>
+        <w:t xml:space="preserve"> </w:t>
+      </w:r>
+      <w:proofErr w:type="spellStart"/>
+      <w:r>
+        <w:rPr>
+          <w:i/>
+          <w:iCs/>
+          <w:sz w:val="22"/>
+          <w:szCs w:val="22"/>
+        </w:rPr>
+        <w:t>the</w:t>
+      </w:r>
+      <w:proofErr w:type="spellEnd"/>
+      <w:r>
+        <w:rPr>
+          <w:i/>
+          <w:iCs/>
+          <w:sz w:val="22"/>
+          <w:szCs w:val="22"/>
+        </w:rPr>
+        <w:t xml:space="preserve"> American </w:t>
+      </w:r>
+      <w:proofErr w:type="spellStart"/>
+      <w:r>
+        <w:rPr>
+          <w:i/>
+          <w:iCs/>
+          <w:sz w:val="22"/>
+          <w:szCs w:val="22"/>
+        </w:rPr>
+        <w:t>Statistical</w:t>
+      </w:r>
+      <w:proofErr w:type="spellEnd"/>
+      <w:r>
+        <w:rPr>
+          <w:i/>
+          <w:iCs/>
+          <w:sz w:val="22"/>
+          <w:szCs w:val="22"/>
+        </w:rPr>
+        <w:t xml:space="preserve"> </w:t>
+      </w:r>
+      <w:proofErr w:type="spellStart"/>
+      <w:r>
+        <w:rPr>
+          <w:i/>
+          <w:iCs/>
+          <w:sz w:val="22"/>
+          <w:szCs w:val="22"/>
+        </w:rPr>
+        <w:t>Association</w:t>
+      </w:r>
+      <w:proofErr w:type="spellEnd"/>
       <w:r>
         <w:rPr>
           <w:sz w:val="22"/>

</xml_diff>